<commit_message>
Update master to output generated at d167106
</commit_message>
<xml_diff>
--- a/adc_sbb_within_100.docx
+++ b/adc_sbb_within_100.docx
@@ -40,7 +40,7 @@
                 <w:rFonts w:ascii="TimeNewRoman" w:hAnsi="TimeNewRoman"/>
                 <w:sz w:val="30"/>
               </w:rPr>
-              <w:t>40-33=</w:t>
+              <w:t>92-65=</w:t>
             </w:r>
           </w:p>
         </w:tc>
@@ -57,7 +57,7 @@
                 <w:rFonts w:ascii="TimeNewRoman" w:hAnsi="TimeNewRoman"/>
                 <w:sz w:val="30"/>
               </w:rPr>
-              <w:t>62-7=</w:t>
+              <w:t>64-49=</w:t>
             </w:r>
           </w:p>
         </w:tc>
@@ -74,7 +74,7 @@
                 <w:rFonts w:ascii="TimeNewRoman" w:hAnsi="TimeNewRoman"/>
                 <w:sz w:val="30"/>
               </w:rPr>
-              <w:t>74-18=</w:t>
+              <w:t>63-58=</w:t>
             </w:r>
           </w:p>
         </w:tc>
@@ -91,7 +91,7 @@
                 <w:rFonts w:ascii="TimeNewRoman" w:hAnsi="TimeNewRoman"/>
                 <w:sz w:val="30"/>
               </w:rPr>
-              <w:t>39+5=</w:t>
+              <w:t>96-78=</w:t>
             </w:r>
           </w:p>
         </w:tc>
@@ -108,7 +108,7 @@
                 <w:rFonts w:ascii="TimeNewRoman" w:hAnsi="TimeNewRoman"/>
                 <w:sz w:val="30"/>
               </w:rPr>
-              <w:t>16+56=</w:t>
+              <w:t>69+29=</w:t>
             </w:r>
           </w:p>
         </w:tc>
@@ -127,7 +127,737 @@
                 <w:rFonts w:ascii="TimeNewRoman" w:hAnsi="TimeNewRoman"/>
                 <w:sz w:val="30"/>
               </w:rPr>
-              <w:t>33-4=</w:t>
+              <w:t>29+54=</w:t>
+            </w:r>
+          </w:p>
+        </w:tc>
+        <w:tc>
+          <w:tcPr>
+            <w:tcW w:type="dxa" w:w="1987"/>
+          </w:tcPr>
+          <w:p>
+            <w:pPr>
+              <w:jc w:val="left"/>
+            </w:pPr>
+            <w:r>
+              <w:rPr>
+                <w:rFonts w:ascii="TimeNewRoman" w:hAnsi="TimeNewRoman"/>
+                <w:sz w:val="30"/>
+              </w:rPr>
+              <w:t>13+68=</w:t>
+            </w:r>
+          </w:p>
+        </w:tc>
+        <w:tc>
+          <w:tcPr>
+            <w:tcW w:type="dxa" w:w="1987"/>
+          </w:tcPr>
+          <w:p>
+            <w:pPr>
+              <w:jc w:val="left"/>
+            </w:pPr>
+            <w:r>
+              <w:rPr>
+                <w:rFonts w:ascii="TimeNewRoman" w:hAnsi="TimeNewRoman"/>
+                <w:sz w:val="30"/>
+              </w:rPr>
+              <w:t>78+18=</w:t>
+            </w:r>
+          </w:p>
+        </w:tc>
+        <w:tc>
+          <w:tcPr>
+            <w:tcW w:type="dxa" w:w="1987"/>
+          </w:tcPr>
+          <w:p>
+            <w:pPr>
+              <w:jc w:val="left"/>
+            </w:pPr>
+            <w:r>
+              <w:rPr>
+                <w:rFonts w:ascii="TimeNewRoman" w:hAnsi="TimeNewRoman"/>
+                <w:sz w:val="30"/>
+              </w:rPr>
+              <w:t>70-39=</w:t>
+            </w:r>
+          </w:p>
+        </w:tc>
+        <w:tc>
+          <w:tcPr>
+            <w:tcW w:type="dxa" w:w="1987"/>
+          </w:tcPr>
+          <w:p>
+            <w:pPr>
+              <w:jc w:val="left"/>
+            </w:pPr>
+            <w:r>
+              <w:rPr>
+                <w:rFonts w:ascii="TimeNewRoman" w:hAnsi="TimeNewRoman"/>
+                <w:sz w:val="30"/>
+              </w:rPr>
+              <w:t>94-8=</w:t>
+            </w:r>
+          </w:p>
+        </w:tc>
+      </w:tr>
+      <w:tr>
+        <w:tc>
+          <w:tcPr>
+            <w:tcW w:type="dxa" w:w="1987"/>
+          </w:tcPr>
+          <w:p>
+            <w:pPr>
+              <w:jc w:val="left"/>
+            </w:pPr>
+            <w:r>
+              <w:rPr>
+                <w:rFonts w:ascii="TimeNewRoman" w:hAnsi="TimeNewRoman"/>
+                <w:sz w:val="30"/>
+              </w:rPr>
+              <w:t>57-19=</w:t>
+            </w:r>
+          </w:p>
+        </w:tc>
+        <w:tc>
+          <w:tcPr>
+            <w:tcW w:type="dxa" w:w="1987"/>
+          </w:tcPr>
+          <w:p>
+            <w:pPr>
+              <w:jc w:val="left"/>
+            </w:pPr>
+            <w:r>
+              <w:rPr>
+                <w:rFonts w:ascii="TimeNewRoman" w:hAnsi="TimeNewRoman"/>
+                <w:sz w:val="30"/>
+              </w:rPr>
+              <w:t>8+24=</w:t>
+            </w:r>
+          </w:p>
+        </w:tc>
+        <w:tc>
+          <w:tcPr>
+            <w:tcW w:type="dxa" w:w="1987"/>
+          </w:tcPr>
+          <w:p>
+            <w:pPr>
+              <w:jc w:val="left"/>
+            </w:pPr>
+            <w:r>
+              <w:rPr>
+                <w:rFonts w:ascii="TimeNewRoman" w:hAnsi="TimeNewRoman"/>
+                <w:sz w:val="30"/>
+              </w:rPr>
+              <w:t>18+48=</w:t>
+            </w:r>
+          </w:p>
+        </w:tc>
+        <w:tc>
+          <w:tcPr>
+            <w:tcW w:type="dxa" w:w="1987"/>
+          </w:tcPr>
+          <w:p>
+            <w:pPr>
+              <w:jc w:val="left"/>
+            </w:pPr>
+            <w:r>
+              <w:rPr>
+                <w:rFonts w:ascii="TimeNewRoman" w:hAnsi="TimeNewRoman"/>
+                <w:sz w:val="30"/>
+              </w:rPr>
+              <w:t>87-49=</w:t>
+            </w:r>
+          </w:p>
+        </w:tc>
+        <w:tc>
+          <w:tcPr>
+            <w:tcW w:type="dxa" w:w="1987"/>
+          </w:tcPr>
+          <w:p>
+            <w:pPr>
+              <w:jc w:val="left"/>
+            </w:pPr>
+            <w:r>
+              <w:rPr>
+                <w:rFonts w:ascii="TimeNewRoman" w:hAnsi="TimeNewRoman"/>
+                <w:sz w:val="30"/>
+              </w:rPr>
+              <w:t>50-17=</w:t>
+            </w:r>
+          </w:p>
+        </w:tc>
+      </w:tr>
+      <w:tr>
+        <w:tc>
+          <w:tcPr>
+            <w:tcW w:type="dxa" w:w="1987"/>
+          </w:tcPr>
+          <w:p>
+            <w:pPr>
+              <w:jc w:val="left"/>
+            </w:pPr>
+            <w:r>
+              <w:rPr>
+                <w:rFonts w:ascii="TimeNewRoman" w:hAnsi="TimeNewRoman"/>
+                <w:sz w:val="30"/>
+              </w:rPr>
+              <w:t>94-67=</w:t>
+            </w:r>
+          </w:p>
+        </w:tc>
+        <w:tc>
+          <w:tcPr>
+            <w:tcW w:type="dxa" w:w="1987"/>
+          </w:tcPr>
+          <w:p>
+            <w:pPr>
+              <w:jc w:val="left"/>
+            </w:pPr>
+            <w:r>
+              <w:rPr>
+                <w:rFonts w:ascii="TimeNewRoman" w:hAnsi="TimeNewRoman"/>
+                <w:sz w:val="30"/>
+              </w:rPr>
+              <w:t>6+29=</w:t>
+            </w:r>
+          </w:p>
+        </w:tc>
+        <w:tc>
+          <w:tcPr>
+            <w:tcW w:type="dxa" w:w="1987"/>
+          </w:tcPr>
+          <w:p>
+            <w:pPr>
+              <w:jc w:val="left"/>
+            </w:pPr>
+            <w:r>
+              <w:rPr>
+                <w:rFonts w:ascii="TimeNewRoman" w:hAnsi="TimeNewRoman"/>
+                <w:sz w:val="30"/>
+              </w:rPr>
+              <w:t>96-89=</w:t>
+            </w:r>
+          </w:p>
+        </w:tc>
+        <w:tc>
+          <w:tcPr>
+            <w:tcW w:type="dxa" w:w="1987"/>
+          </w:tcPr>
+          <w:p>
+            <w:pPr>
+              <w:jc w:val="left"/>
+            </w:pPr>
+            <w:r>
+              <w:rPr>
+                <w:rFonts w:ascii="TimeNewRoman" w:hAnsi="TimeNewRoman"/>
+                <w:sz w:val="30"/>
+              </w:rPr>
+              <w:t>9+69=</w:t>
+            </w:r>
+          </w:p>
+        </w:tc>
+        <w:tc>
+          <w:tcPr>
+            <w:tcW w:type="dxa" w:w="1987"/>
+          </w:tcPr>
+          <w:p>
+            <w:pPr>
+              <w:jc w:val="left"/>
+            </w:pPr>
+            <w:r>
+              <w:rPr>
+                <w:rFonts w:ascii="TimeNewRoman" w:hAnsi="TimeNewRoman"/>
+                <w:sz w:val="30"/>
+              </w:rPr>
+              <w:t>92-64=</w:t>
+            </w:r>
+          </w:p>
+        </w:tc>
+      </w:tr>
+      <w:tr>
+        <w:tc>
+          <w:tcPr>
+            <w:tcW w:type="dxa" w:w="1987"/>
+          </w:tcPr>
+          <w:p>
+            <w:pPr>
+              <w:jc w:val="left"/>
+            </w:pPr>
+            <w:r>
+              <w:rPr>
+                <w:rFonts w:ascii="TimeNewRoman" w:hAnsi="TimeNewRoman"/>
+                <w:sz w:val="30"/>
+              </w:rPr>
+              <w:t>55+28=</w:t>
+            </w:r>
+          </w:p>
+        </w:tc>
+        <w:tc>
+          <w:tcPr>
+            <w:tcW w:type="dxa" w:w="1987"/>
+          </w:tcPr>
+          <w:p>
+            <w:pPr>
+              <w:jc w:val="left"/>
+            </w:pPr>
+            <w:r>
+              <w:rPr>
+                <w:rFonts w:ascii="TimeNewRoman" w:hAnsi="TimeNewRoman"/>
+                <w:sz w:val="30"/>
+              </w:rPr>
+              <w:t>90-41=</w:t>
+            </w:r>
+          </w:p>
+        </w:tc>
+        <w:tc>
+          <w:tcPr>
+            <w:tcW w:type="dxa" w:w="1987"/>
+          </w:tcPr>
+          <w:p>
+            <w:pPr>
+              <w:jc w:val="left"/>
+            </w:pPr>
+            <w:r>
+              <w:rPr>
+                <w:rFonts w:ascii="TimeNewRoman" w:hAnsi="TimeNewRoman"/>
+                <w:sz w:val="30"/>
+              </w:rPr>
+              <w:t>2+79=</w:t>
+            </w:r>
+          </w:p>
+        </w:tc>
+        <w:tc>
+          <w:tcPr>
+            <w:tcW w:type="dxa" w:w="1987"/>
+          </w:tcPr>
+          <w:p>
+            <w:pPr>
+              <w:jc w:val="left"/>
+            </w:pPr>
+            <w:r>
+              <w:rPr>
+                <w:rFonts w:ascii="TimeNewRoman" w:hAnsi="TimeNewRoman"/>
+                <w:sz w:val="30"/>
+              </w:rPr>
+              <w:t>30-26=</w:t>
+            </w:r>
+          </w:p>
+        </w:tc>
+        <w:tc>
+          <w:tcPr>
+            <w:tcW w:type="dxa" w:w="1987"/>
+          </w:tcPr>
+          <w:p>
+            <w:pPr>
+              <w:jc w:val="left"/>
+            </w:pPr>
+            <w:r>
+              <w:rPr>
+                <w:rFonts w:ascii="TimeNewRoman" w:hAnsi="TimeNewRoman"/>
+                <w:sz w:val="30"/>
+              </w:rPr>
+              <w:t>17+45=</w:t>
+            </w:r>
+          </w:p>
+        </w:tc>
+      </w:tr>
+      <w:tr>
+        <w:tc>
+          <w:tcPr>
+            <w:tcW w:type="dxa" w:w="1987"/>
+          </w:tcPr>
+          <w:p>
+            <w:pPr>
+              <w:jc w:val="left"/>
+            </w:pPr>
+            <w:r>
+              <w:rPr>
+                <w:rFonts w:ascii="TimeNewRoman" w:hAnsi="TimeNewRoman"/>
+                <w:sz w:val="30"/>
+              </w:rPr>
+              <w:t>43-27=</w:t>
+            </w:r>
+          </w:p>
+        </w:tc>
+        <w:tc>
+          <w:tcPr>
+            <w:tcW w:type="dxa" w:w="1987"/>
+          </w:tcPr>
+          <w:p>
+            <w:pPr>
+              <w:jc w:val="left"/>
+            </w:pPr>
+            <w:r>
+              <w:rPr>
+                <w:rFonts w:ascii="TimeNewRoman" w:hAnsi="TimeNewRoman"/>
+                <w:sz w:val="30"/>
+              </w:rPr>
+              <w:t>80-37=</w:t>
+            </w:r>
+          </w:p>
+        </w:tc>
+        <w:tc>
+          <w:tcPr>
+            <w:tcW w:type="dxa" w:w="1987"/>
+          </w:tcPr>
+          <w:p>
+            <w:pPr>
+              <w:jc w:val="left"/>
+            </w:pPr>
+            <w:r>
+              <w:rPr>
+                <w:rFonts w:ascii="TimeNewRoman" w:hAnsi="TimeNewRoman"/>
+                <w:sz w:val="30"/>
+              </w:rPr>
+              <w:t>7+4=</w:t>
+            </w:r>
+          </w:p>
+        </w:tc>
+        <w:tc>
+          <w:tcPr>
+            <w:tcW w:type="dxa" w:w="1987"/>
+          </w:tcPr>
+          <w:p>
+            <w:pPr>
+              <w:jc w:val="left"/>
+            </w:pPr>
+            <w:r>
+              <w:rPr>
+                <w:rFonts w:ascii="TimeNewRoman" w:hAnsi="TimeNewRoman"/>
+                <w:sz w:val="30"/>
+              </w:rPr>
+              <w:t>16+19=</w:t>
+            </w:r>
+          </w:p>
+        </w:tc>
+        <w:tc>
+          <w:tcPr>
+            <w:tcW w:type="dxa" w:w="1987"/>
+          </w:tcPr>
+          <w:p>
+            <w:pPr>
+              <w:jc w:val="left"/>
+            </w:pPr>
+            <w:r>
+              <w:rPr>
+                <w:rFonts w:ascii="TimeNewRoman" w:hAnsi="TimeNewRoman"/>
+                <w:sz w:val="30"/>
+              </w:rPr>
+              <w:t>68+19=</w:t>
+            </w:r>
+          </w:p>
+        </w:tc>
+      </w:tr>
+      <w:tr>
+        <w:tc>
+          <w:tcPr>
+            <w:tcW w:type="dxa" w:w="1987"/>
+          </w:tcPr>
+          <w:p>
+            <w:pPr>
+              <w:jc w:val="left"/>
+            </w:pPr>
+            <w:r>
+              <w:rPr>
+                <w:rFonts w:ascii="TimeNewRoman" w:hAnsi="TimeNewRoman"/>
+                <w:sz w:val="30"/>
+              </w:rPr>
+              <w:t>47+36=</w:t>
+            </w:r>
+          </w:p>
+        </w:tc>
+        <w:tc>
+          <w:tcPr>
+            <w:tcW w:type="dxa" w:w="1987"/>
+          </w:tcPr>
+          <w:p>
+            <w:pPr>
+              <w:jc w:val="left"/>
+            </w:pPr>
+            <w:r>
+              <w:rPr>
+                <w:rFonts w:ascii="TimeNewRoman" w:hAnsi="TimeNewRoman"/>
+                <w:sz w:val="30"/>
+              </w:rPr>
+              <w:t>84-76=</w:t>
+            </w:r>
+          </w:p>
+        </w:tc>
+        <w:tc>
+          <w:tcPr>
+            <w:tcW w:type="dxa" w:w="1987"/>
+          </w:tcPr>
+          <w:p>
+            <w:pPr>
+              <w:jc w:val="left"/>
+            </w:pPr>
+            <w:r>
+              <w:rPr>
+                <w:rFonts w:ascii="TimeNewRoman" w:hAnsi="TimeNewRoman"/>
+                <w:sz w:val="30"/>
+              </w:rPr>
+              <w:t>39+18=</w:t>
+            </w:r>
+          </w:p>
+        </w:tc>
+        <w:tc>
+          <w:tcPr>
+            <w:tcW w:type="dxa" w:w="1987"/>
+          </w:tcPr>
+          <w:p>
+            <w:pPr>
+              <w:jc w:val="left"/>
+            </w:pPr>
+            <w:r>
+              <w:rPr>
+                <w:rFonts w:ascii="TimeNewRoman" w:hAnsi="TimeNewRoman"/>
+                <w:sz w:val="30"/>
+              </w:rPr>
+              <w:t>69+26=</w:t>
+            </w:r>
+          </w:p>
+        </w:tc>
+        <w:tc>
+          <w:tcPr>
+            <w:tcW w:type="dxa" w:w="1987"/>
+          </w:tcPr>
+          <w:p>
+            <w:pPr>
+              <w:jc w:val="left"/>
+            </w:pPr>
+            <w:r>
+              <w:rPr>
+                <w:rFonts w:ascii="TimeNewRoman" w:hAnsi="TimeNewRoman"/>
+                <w:sz w:val="30"/>
+              </w:rPr>
+              <w:t>90-75=</w:t>
+            </w:r>
+          </w:p>
+        </w:tc>
+      </w:tr>
+      <w:tr>
+        <w:tc>
+          <w:tcPr>
+            <w:tcW w:type="dxa" w:w="1987"/>
+          </w:tcPr>
+          <w:p>
+            <w:pPr>
+              <w:jc w:val="left"/>
+            </w:pPr>
+            <w:r>
+              <w:rPr>
+                <w:rFonts w:ascii="TimeNewRoman" w:hAnsi="TimeNewRoman"/>
+                <w:sz w:val="30"/>
+              </w:rPr>
+              <w:t>56+19=</w:t>
+            </w:r>
+          </w:p>
+        </w:tc>
+        <w:tc>
+          <w:tcPr>
+            <w:tcW w:type="dxa" w:w="1987"/>
+          </w:tcPr>
+          <w:p>
+            <w:pPr>
+              <w:jc w:val="left"/>
+            </w:pPr>
+            <w:r>
+              <w:rPr>
+                <w:rFonts w:ascii="TimeNewRoman" w:hAnsi="TimeNewRoman"/>
+                <w:sz w:val="30"/>
+              </w:rPr>
+              <w:t>95-67=</w:t>
+            </w:r>
+          </w:p>
+        </w:tc>
+        <w:tc>
+          <w:tcPr>
+            <w:tcW w:type="dxa" w:w="1987"/>
+          </w:tcPr>
+          <w:p>
+            <w:pPr>
+              <w:jc w:val="left"/>
+            </w:pPr>
+            <w:r>
+              <w:rPr>
+                <w:rFonts w:ascii="TimeNewRoman" w:hAnsi="TimeNewRoman"/>
+                <w:sz w:val="30"/>
+              </w:rPr>
+              <w:t>54-28=</w:t>
+            </w:r>
+          </w:p>
+        </w:tc>
+        <w:tc>
+          <w:tcPr>
+            <w:tcW w:type="dxa" w:w="1987"/>
+          </w:tcPr>
+          <w:p>
+            <w:pPr>
+              <w:jc w:val="left"/>
+            </w:pPr>
+            <w:r>
+              <w:rPr>
+                <w:rFonts w:ascii="TimeNewRoman" w:hAnsi="TimeNewRoman"/>
+                <w:sz w:val="30"/>
+              </w:rPr>
+              <w:t>2+9=</w:t>
+            </w:r>
+          </w:p>
+        </w:tc>
+        <w:tc>
+          <w:tcPr>
+            <w:tcW w:type="dxa" w:w="1987"/>
+          </w:tcPr>
+          <w:p>
+            <w:pPr>
+              <w:jc w:val="left"/>
+            </w:pPr>
+            <w:r>
+              <w:rPr>
+                <w:rFonts w:ascii="TimeNewRoman" w:hAnsi="TimeNewRoman"/>
+                <w:sz w:val="30"/>
+              </w:rPr>
+              <w:t>68+15=</w:t>
+            </w:r>
+          </w:p>
+        </w:tc>
+      </w:tr>
+      <w:tr>
+        <w:tc>
+          <w:tcPr>
+            <w:tcW w:type="dxa" w:w="1987"/>
+          </w:tcPr>
+          <w:p>
+            <w:pPr>
+              <w:jc w:val="left"/>
+            </w:pPr>
+            <w:r>
+              <w:rPr>
+                <w:rFonts w:ascii="TimeNewRoman" w:hAnsi="TimeNewRoman"/>
+                <w:sz w:val="30"/>
+              </w:rPr>
+              <w:t>62-29=</w:t>
+            </w:r>
+          </w:p>
+        </w:tc>
+        <w:tc>
+          <w:tcPr>
+            <w:tcW w:type="dxa" w:w="1987"/>
+          </w:tcPr>
+          <w:p>
+            <w:pPr>
+              <w:jc w:val="left"/>
+            </w:pPr>
+            <w:r>
+              <w:rPr>
+                <w:rFonts w:ascii="TimeNewRoman" w:hAnsi="TimeNewRoman"/>
+                <w:sz w:val="30"/>
+              </w:rPr>
+              <w:t>72-4=</w:t>
+            </w:r>
+          </w:p>
+        </w:tc>
+        <w:tc>
+          <w:tcPr>
+            <w:tcW w:type="dxa" w:w="1987"/>
+          </w:tcPr>
+          <w:p>
+            <w:pPr>
+              <w:jc w:val="left"/>
+            </w:pPr>
+            <w:r>
+              <w:rPr>
+                <w:rFonts w:ascii="TimeNewRoman" w:hAnsi="TimeNewRoman"/>
+                <w:sz w:val="30"/>
+              </w:rPr>
+              <w:t>77-38=</w:t>
+            </w:r>
+          </w:p>
+        </w:tc>
+        <w:tc>
+          <w:tcPr>
+            <w:tcW w:type="dxa" w:w="1987"/>
+          </w:tcPr>
+          <w:p>
+            <w:pPr>
+              <w:jc w:val="left"/>
+            </w:pPr>
+            <w:r>
+              <w:rPr>
+                <w:rFonts w:ascii="TimeNewRoman" w:hAnsi="TimeNewRoman"/>
+                <w:sz w:val="30"/>
+              </w:rPr>
+              <w:t>39+22=</w:t>
+            </w:r>
+          </w:p>
+        </w:tc>
+        <w:tc>
+          <w:tcPr>
+            <w:tcW w:type="dxa" w:w="1987"/>
+          </w:tcPr>
+          <w:p>
+            <w:pPr>
+              <w:jc w:val="left"/>
+            </w:pPr>
+            <w:r>
+              <w:rPr>
+                <w:rFonts w:ascii="TimeNewRoman" w:hAnsi="TimeNewRoman"/>
+                <w:sz w:val="30"/>
+              </w:rPr>
+              <w:t>31-29=</w:t>
+            </w:r>
+          </w:p>
+        </w:tc>
+      </w:tr>
+      <w:tr>
+        <w:tc>
+          <w:tcPr>
+            <w:tcW w:type="dxa" w:w="1987"/>
+          </w:tcPr>
+          <w:p>
+            <w:pPr>
+              <w:jc w:val="left"/>
+            </w:pPr>
+            <w:r>
+              <w:rPr>
+                <w:rFonts w:ascii="TimeNewRoman" w:hAnsi="TimeNewRoman"/>
+                <w:sz w:val="30"/>
+              </w:rPr>
+              <w:t>93-35=</w:t>
+            </w:r>
+          </w:p>
+        </w:tc>
+        <w:tc>
+          <w:tcPr>
+            <w:tcW w:type="dxa" w:w="1987"/>
+          </w:tcPr>
+          <w:p>
+            <w:pPr>
+              <w:jc w:val="left"/>
+            </w:pPr>
+            <w:r>
+              <w:rPr>
+                <w:rFonts w:ascii="TimeNewRoman" w:hAnsi="TimeNewRoman"/>
+                <w:sz w:val="30"/>
+              </w:rPr>
+              <w:t>49+22=</w:t>
+            </w:r>
+          </w:p>
+        </w:tc>
+        <w:tc>
+          <w:tcPr>
+            <w:tcW w:type="dxa" w:w="1987"/>
+          </w:tcPr>
+          <w:p>
+            <w:pPr>
+              <w:jc w:val="left"/>
+            </w:pPr>
+            <w:r>
+              <w:rPr>
+                <w:rFonts w:ascii="TimeNewRoman" w:hAnsi="TimeNewRoman"/>
+                <w:sz w:val="30"/>
+              </w:rPr>
+              <w:t>90-88=</w:t>
             </w:r>
           </w:p>
         </w:tc>
@@ -161,41 +891,7 @@
                 <w:rFonts w:ascii="TimeNewRoman" w:hAnsi="TimeNewRoman"/>
                 <w:sz w:val="30"/>
               </w:rPr>
-              <w:t>93-85=</w:t>
-            </w:r>
-          </w:p>
-        </w:tc>
-        <w:tc>
-          <w:tcPr>
-            <w:tcW w:type="dxa" w:w="1987"/>
-          </w:tcPr>
-          <w:p>
-            <w:pPr>
-              <w:jc w:val="left"/>
-            </w:pPr>
-            <w:r>
-              <w:rPr>
-                <w:rFonts w:ascii="TimeNewRoman" w:hAnsi="TimeNewRoman"/>
-                <w:sz w:val="30"/>
-              </w:rPr>
-              <w:t>95-87=</w:t>
-            </w:r>
-          </w:p>
-        </w:tc>
-        <w:tc>
-          <w:tcPr>
-            <w:tcW w:type="dxa" w:w="1987"/>
-          </w:tcPr>
-          <w:p>
-            <w:pPr>
-              <w:jc w:val="left"/>
-            </w:pPr>
-            <w:r>
-              <w:rPr>
-                <w:rFonts w:ascii="TimeNewRoman" w:hAnsi="TimeNewRoman"/>
-                <w:sz w:val="30"/>
-              </w:rPr>
-              <w:t>71-6=</w:t>
+              <w:t>19+76=</w:t>
             </w:r>
           </w:p>
         </w:tc>
@@ -214,7 +910,7 @@
                 <w:rFonts w:ascii="TimeNewRoman" w:hAnsi="TimeNewRoman"/>
                 <w:sz w:val="30"/>
               </w:rPr>
-              <w:t>2+29=</w:t>
+              <w:t>82-46=</w:t>
             </w:r>
           </w:p>
         </w:tc>
@@ -231,7 +927,7 @@
                 <w:rFonts w:ascii="TimeNewRoman" w:hAnsi="TimeNewRoman"/>
                 <w:sz w:val="30"/>
               </w:rPr>
-              <w:t>27+38=</w:t>
+              <w:t>92-15=</w:t>
             </w:r>
           </w:p>
         </w:tc>
@@ -248,7 +944,7 @@
                 <w:rFonts w:ascii="TimeNewRoman" w:hAnsi="TimeNewRoman"/>
                 <w:sz w:val="30"/>
               </w:rPr>
-              <w:t>39+19=</w:t>
+              <w:t>9+64=</w:t>
             </w:r>
           </w:p>
         </w:tc>
@@ -265,7 +961,7 @@
                 <w:rFonts w:ascii="TimeNewRoman" w:hAnsi="TimeNewRoman"/>
                 <w:sz w:val="30"/>
               </w:rPr>
-              <w:t>92-7=</w:t>
+              <w:t>92-25=</w:t>
             </w:r>
           </w:p>
         </w:tc>
@@ -282,7 +978,7 @@
                 <w:rFonts w:ascii="TimeNewRoman" w:hAnsi="TimeNewRoman"/>
                 <w:sz w:val="30"/>
               </w:rPr>
-              <w:t>41-18=</w:t>
+              <w:t>90-89=</w:t>
             </w:r>
           </w:p>
         </w:tc>
@@ -301,7 +997,7 @@
                 <w:rFonts w:ascii="TimeNewRoman" w:hAnsi="TimeNewRoman"/>
                 <w:sz w:val="30"/>
               </w:rPr>
-              <w:t>87-68=</w:t>
+              <w:t>8+39=</w:t>
             </w:r>
           </w:p>
         </w:tc>
@@ -318,7 +1014,7 @@
                 <w:rFonts w:ascii="TimeNewRoman" w:hAnsi="TimeNewRoman"/>
                 <w:sz w:val="30"/>
               </w:rPr>
-              <w:t>19+38=</w:t>
+              <w:t>84-38=</w:t>
             </w:r>
           </w:p>
         </w:tc>
@@ -335,7 +1031,7 @@
                 <w:rFonts w:ascii="TimeNewRoman" w:hAnsi="TimeNewRoman"/>
                 <w:sz w:val="30"/>
               </w:rPr>
-              <w:t>8+8=</w:t>
+              <w:t>18+35=</w:t>
             </w:r>
           </w:p>
         </w:tc>
@@ -352,703 +1048,7 @@
                 <w:rFonts w:ascii="TimeNewRoman" w:hAnsi="TimeNewRoman"/>
                 <w:sz w:val="30"/>
               </w:rPr>
-              <w:t>57+6=</w:t>
-            </w:r>
-          </w:p>
-        </w:tc>
-        <w:tc>
-          <w:tcPr>
-            <w:tcW w:type="dxa" w:w="1987"/>
-          </w:tcPr>
-          <w:p>
-            <w:pPr>
-              <w:jc w:val="left"/>
-            </w:pPr>
-            <w:r>
-              <w:rPr>
-                <w:rFonts w:ascii="TimeNewRoman" w:hAnsi="TimeNewRoman"/>
-                <w:sz w:val="30"/>
-              </w:rPr>
-              <w:t>58+8=</w:t>
-            </w:r>
-          </w:p>
-        </w:tc>
-      </w:tr>
-      <w:tr>
-        <w:tc>
-          <w:tcPr>
-            <w:tcW w:type="dxa" w:w="1987"/>
-          </w:tcPr>
-          <w:p>
-            <w:pPr>
-              <w:jc w:val="left"/>
-            </w:pPr>
-            <w:r>
-              <w:rPr>
-                <w:rFonts w:ascii="TimeNewRoman" w:hAnsi="TimeNewRoman"/>
-                <w:sz w:val="30"/>
-              </w:rPr>
-              <w:t>68+7=</w:t>
-            </w:r>
-          </w:p>
-        </w:tc>
-        <w:tc>
-          <w:tcPr>
-            <w:tcW w:type="dxa" w:w="1987"/>
-          </w:tcPr>
-          <w:p>
-            <w:pPr>
-              <w:jc w:val="left"/>
-            </w:pPr>
-            <w:r>
-              <w:rPr>
-                <w:rFonts w:ascii="TimeNewRoman" w:hAnsi="TimeNewRoman"/>
-                <w:sz w:val="30"/>
-              </w:rPr>
-              <w:t>58+6=</w:t>
-            </w:r>
-          </w:p>
-        </w:tc>
-        <w:tc>
-          <w:tcPr>
-            <w:tcW w:type="dxa" w:w="1987"/>
-          </w:tcPr>
-          <w:p>
-            <w:pPr>
-              <w:jc w:val="left"/>
-            </w:pPr>
-            <w:r>
-              <w:rPr>
-                <w:rFonts w:ascii="TimeNewRoman" w:hAnsi="TimeNewRoman"/>
-                <w:sz w:val="30"/>
-              </w:rPr>
-              <w:t>65+19=</w:t>
-            </w:r>
-          </w:p>
-        </w:tc>
-        <w:tc>
-          <w:tcPr>
-            <w:tcW w:type="dxa" w:w="1987"/>
-          </w:tcPr>
-          <w:p>
-            <w:pPr>
-              <w:jc w:val="left"/>
-            </w:pPr>
-            <w:r>
-              <w:rPr>
-                <w:rFonts w:ascii="TimeNewRoman" w:hAnsi="TimeNewRoman"/>
-                <w:sz w:val="30"/>
-              </w:rPr>
-              <w:t>70-14=</w:t>
-            </w:r>
-          </w:p>
-        </w:tc>
-        <w:tc>
-          <w:tcPr>
-            <w:tcW w:type="dxa" w:w="1987"/>
-          </w:tcPr>
-          <w:p>
-            <w:pPr>
-              <w:jc w:val="left"/>
-            </w:pPr>
-            <w:r>
-              <w:rPr>
-                <w:rFonts w:ascii="TimeNewRoman" w:hAnsi="TimeNewRoman"/>
-                <w:sz w:val="30"/>
-              </w:rPr>
-              <w:t>28+53=</w:t>
-            </w:r>
-          </w:p>
-        </w:tc>
-      </w:tr>
-      <w:tr>
-        <w:tc>
-          <w:tcPr>
-            <w:tcW w:type="dxa" w:w="1987"/>
-          </w:tcPr>
-          <w:p>
-            <w:pPr>
-              <w:jc w:val="left"/>
-            </w:pPr>
-            <w:r>
-              <w:rPr>
-                <w:rFonts w:ascii="TimeNewRoman" w:hAnsi="TimeNewRoman"/>
-                <w:sz w:val="30"/>
-              </w:rPr>
-              <w:t>36+6=</w:t>
-            </w:r>
-          </w:p>
-        </w:tc>
-        <w:tc>
-          <w:tcPr>
-            <w:tcW w:type="dxa" w:w="1987"/>
-          </w:tcPr>
-          <w:p>
-            <w:pPr>
-              <w:jc w:val="left"/>
-            </w:pPr>
-            <w:r>
-              <w:rPr>
-                <w:rFonts w:ascii="TimeNewRoman" w:hAnsi="TimeNewRoman"/>
-                <w:sz w:val="30"/>
-              </w:rPr>
-              <w:t>48+46=</w:t>
-            </w:r>
-          </w:p>
-        </w:tc>
-        <w:tc>
-          <w:tcPr>
-            <w:tcW w:type="dxa" w:w="1987"/>
-          </w:tcPr>
-          <w:p>
-            <w:pPr>
-              <w:jc w:val="left"/>
-            </w:pPr>
-            <w:r>
-              <w:rPr>
-                <w:rFonts w:ascii="TimeNewRoman" w:hAnsi="TimeNewRoman"/>
-                <w:sz w:val="30"/>
-              </w:rPr>
-              <w:t>63-26=</w:t>
-            </w:r>
-          </w:p>
-        </w:tc>
-        <w:tc>
-          <w:tcPr>
-            <w:tcW w:type="dxa" w:w="1987"/>
-          </w:tcPr>
-          <w:p>
-            <w:pPr>
-              <w:jc w:val="left"/>
-            </w:pPr>
-            <w:r>
-              <w:rPr>
-                <w:rFonts w:ascii="TimeNewRoman" w:hAnsi="TimeNewRoman"/>
-                <w:sz w:val="30"/>
-              </w:rPr>
-              <w:t>46-39=</w:t>
-            </w:r>
-          </w:p>
-        </w:tc>
-        <w:tc>
-          <w:tcPr>
-            <w:tcW w:type="dxa" w:w="1987"/>
-          </w:tcPr>
-          <w:p>
-            <w:pPr>
-              <w:jc w:val="left"/>
-            </w:pPr>
-            <w:r>
-              <w:rPr>
-                <w:rFonts w:ascii="TimeNewRoman" w:hAnsi="TimeNewRoman"/>
-                <w:sz w:val="30"/>
-              </w:rPr>
-              <w:t>68+18=</w:t>
-            </w:r>
-          </w:p>
-        </w:tc>
-      </w:tr>
-      <w:tr>
-        <w:tc>
-          <w:tcPr>
-            <w:tcW w:type="dxa" w:w="1987"/>
-          </w:tcPr>
-          <w:p>
-            <w:pPr>
-              <w:jc w:val="left"/>
-            </w:pPr>
-            <w:r>
-              <w:rPr>
-                <w:rFonts w:ascii="TimeNewRoman" w:hAnsi="TimeNewRoman"/>
-                <w:sz w:val="30"/>
-              </w:rPr>
-              <w:t>94-85=</w:t>
-            </w:r>
-          </w:p>
-        </w:tc>
-        <w:tc>
-          <w:tcPr>
-            <w:tcW w:type="dxa" w:w="1987"/>
-          </w:tcPr>
-          <w:p>
-            <w:pPr>
-              <w:jc w:val="left"/>
-            </w:pPr>
-            <w:r>
-              <w:rPr>
-                <w:rFonts w:ascii="TimeNewRoman" w:hAnsi="TimeNewRoman"/>
-                <w:sz w:val="30"/>
-              </w:rPr>
-              <w:t>29+63=</w:t>
-            </w:r>
-          </w:p>
-        </w:tc>
-        <w:tc>
-          <w:tcPr>
-            <w:tcW w:type="dxa" w:w="1987"/>
-          </w:tcPr>
-          <w:p>
-            <w:pPr>
-              <w:jc w:val="left"/>
-            </w:pPr>
-            <w:r>
-              <w:rPr>
-                <w:rFonts w:ascii="TimeNewRoman" w:hAnsi="TimeNewRoman"/>
-                <w:sz w:val="30"/>
-              </w:rPr>
-              <w:t>39+46=</w:t>
-            </w:r>
-          </w:p>
-        </w:tc>
-        <w:tc>
-          <w:tcPr>
-            <w:tcW w:type="dxa" w:w="1987"/>
-          </w:tcPr>
-          <w:p>
-            <w:pPr>
-              <w:jc w:val="left"/>
-            </w:pPr>
-            <w:r>
-              <w:rPr>
-                <w:rFonts w:ascii="TimeNewRoman" w:hAnsi="TimeNewRoman"/>
-                <w:sz w:val="30"/>
-              </w:rPr>
-              <w:t>4+77=</w:t>
-            </w:r>
-          </w:p>
-        </w:tc>
-        <w:tc>
-          <w:tcPr>
-            <w:tcW w:type="dxa" w:w="1987"/>
-          </w:tcPr>
-          <w:p>
-            <w:pPr>
-              <w:jc w:val="left"/>
-            </w:pPr>
-            <w:r>
-              <w:rPr>
-                <w:rFonts w:ascii="TimeNewRoman" w:hAnsi="TimeNewRoman"/>
-                <w:sz w:val="30"/>
-              </w:rPr>
-              <w:t>34+7=</w:t>
-            </w:r>
-          </w:p>
-        </w:tc>
-      </w:tr>
-      <w:tr>
-        <w:tc>
-          <w:tcPr>
-            <w:tcW w:type="dxa" w:w="1987"/>
-          </w:tcPr>
-          <w:p>
-            <w:pPr>
-              <w:jc w:val="left"/>
-            </w:pPr>
-            <w:r>
-              <w:rPr>
-                <w:rFonts w:ascii="TimeNewRoman" w:hAnsi="TimeNewRoman"/>
-                <w:sz w:val="30"/>
-              </w:rPr>
-              <w:t>28+43=</w:t>
-            </w:r>
-          </w:p>
-        </w:tc>
-        <w:tc>
-          <w:tcPr>
-            <w:tcW w:type="dxa" w:w="1987"/>
-          </w:tcPr>
-          <w:p>
-            <w:pPr>
-              <w:jc w:val="left"/>
-            </w:pPr>
-            <w:r>
-              <w:rPr>
-                <w:rFonts w:ascii="TimeNewRoman" w:hAnsi="TimeNewRoman"/>
-                <w:sz w:val="30"/>
-              </w:rPr>
-              <w:t>57+28=</w:t>
-            </w:r>
-          </w:p>
-        </w:tc>
-        <w:tc>
-          <w:tcPr>
-            <w:tcW w:type="dxa" w:w="1987"/>
-          </w:tcPr>
-          <w:p>
-            <w:pPr>
-              <w:jc w:val="left"/>
-            </w:pPr>
-            <w:r>
-              <w:rPr>
-                <w:rFonts w:ascii="TimeNewRoman" w:hAnsi="TimeNewRoman"/>
-                <w:sz w:val="30"/>
-              </w:rPr>
-              <w:t>8+69=</w:t>
-            </w:r>
-          </w:p>
-        </w:tc>
-        <w:tc>
-          <w:tcPr>
-            <w:tcW w:type="dxa" w:w="1987"/>
-          </w:tcPr>
-          <w:p>
-            <w:pPr>
-              <w:jc w:val="left"/>
-            </w:pPr>
-            <w:r>
-              <w:rPr>
-                <w:rFonts w:ascii="TimeNewRoman" w:hAnsi="TimeNewRoman"/>
-                <w:sz w:val="30"/>
-              </w:rPr>
-              <w:t>93-9=</w:t>
-            </w:r>
-          </w:p>
-        </w:tc>
-        <w:tc>
-          <w:tcPr>
-            <w:tcW w:type="dxa" w:w="1987"/>
-          </w:tcPr>
-          <w:p>
-            <w:pPr>
-              <w:jc w:val="left"/>
-            </w:pPr>
-            <w:r>
-              <w:rPr>
-                <w:rFonts w:ascii="TimeNewRoman" w:hAnsi="TimeNewRoman"/>
-                <w:sz w:val="30"/>
-              </w:rPr>
-              <w:t>57-19=</w:t>
-            </w:r>
-          </w:p>
-        </w:tc>
-      </w:tr>
-      <w:tr>
-        <w:tc>
-          <w:tcPr>
-            <w:tcW w:type="dxa" w:w="1987"/>
-          </w:tcPr>
-          <w:p>
-            <w:pPr>
-              <w:jc w:val="left"/>
-            </w:pPr>
-            <w:r>
-              <w:rPr>
-                <w:rFonts w:ascii="TimeNewRoman" w:hAnsi="TimeNewRoman"/>
-                <w:sz w:val="30"/>
-              </w:rPr>
-              <w:t>53-37=</w:t>
-            </w:r>
-          </w:p>
-        </w:tc>
-        <w:tc>
-          <w:tcPr>
-            <w:tcW w:type="dxa" w:w="1987"/>
-          </w:tcPr>
-          <w:p>
-            <w:pPr>
-              <w:jc w:val="left"/>
-            </w:pPr>
-            <w:r>
-              <w:rPr>
-                <w:rFonts w:ascii="TimeNewRoman" w:hAnsi="TimeNewRoman"/>
-                <w:sz w:val="30"/>
-              </w:rPr>
-              <w:t>6+9=</w:t>
-            </w:r>
-          </w:p>
-        </w:tc>
-        <w:tc>
-          <w:tcPr>
-            <w:tcW w:type="dxa" w:w="1987"/>
-          </w:tcPr>
-          <w:p>
-            <w:pPr>
-              <w:jc w:val="left"/>
-            </w:pPr>
-            <w:r>
-              <w:rPr>
-                <w:rFonts w:ascii="TimeNewRoman" w:hAnsi="TimeNewRoman"/>
-                <w:sz w:val="30"/>
-              </w:rPr>
-              <w:t>82-75=</w:t>
-            </w:r>
-          </w:p>
-        </w:tc>
-        <w:tc>
-          <w:tcPr>
-            <w:tcW w:type="dxa" w:w="1987"/>
-          </w:tcPr>
-          <w:p>
-            <w:pPr>
-              <w:jc w:val="left"/>
-            </w:pPr>
-            <w:r>
-              <w:rPr>
-                <w:rFonts w:ascii="TimeNewRoman" w:hAnsi="TimeNewRoman"/>
-                <w:sz w:val="30"/>
-              </w:rPr>
-              <w:t>42-38=</w:t>
-            </w:r>
-          </w:p>
-        </w:tc>
-        <w:tc>
-          <w:tcPr>
-            <w:tcW w:type="dxa" w:w="1987"/>
-          </w:tcPr>
-          <w:p>
-            <w:pPr>
-              <w:jc w:val="left"/>
-            </w:pPr>
-            <w:r>
-              <w:rPr>
-                <w:rFonts w:ascii="TimeNewRoman" w:hAnsi="TimeNewRoman"/>
-                <w:sz w:val="30"/>
-              </w:rPr>
-              <w:t>24+47=</w:t>
-            </w:r>
-          </w:p>
-        </w:tc>
-      </w:tr>
-      <w:tr>
-        <w:tc>
-          <w:tcPr>
-            <w:tcW w:type="dxa" w:w="1987"/>
-          </w:tcPr>
-          <w:p>
-            <w:pPr>
-              <w:jc w:val="left"/>
-            </w:pPr>
-            <w:r>
-              <w:rPr>
-                <w:rFonts w:ascii="TimeNewRoman" w:hAnsi="TimeNewRoman"/>
-                <w:sz w:val="30"/>
-              </w:rPr>
-              <w:t>7+45=</w:t>
-            </w:r>
-          </w:p>
-        </w:tc>
-        <w:tc>
-          <w:tcPr>
-            <w:tcW w:type="dxa" w:w="1987"/>
-          </w:tcPr>
-          <w:p>
-            <w:pPr>
-              <w:jc w:val="left"/>
-            </w:pPr>
-            <w:r>
-              <w:rPr>
-                <w:rFonts w:ascii="TimeNewRoman" w:hAnsi="TimeNewRoman"/>
-                <w:sz w:val="30"/>
-              </w:rPr>
-              <w:t>94-8=</w:t>
-            </w:r>
-          </w:p>
-        </w:tc>
-        <w:tc>
-          <w:tcPr>
-            <w:tcW w:type="dxa" w:w="1987"/>
-          </w:tcPr>
-          <w:p>
-            <w:pPr>
-              <w:jc w:val="left"/>
-            </w:pPr>
-            <w:r>
-              <w:rPr>
-                <w:rFonts w:ascii="TimeNewRoman" w:hAnsi="TimeNewRoman"/>
-                <w:sz w:val="30"/>
-              </w:rPr>
-              <w:t>16+37=</w:t>
-            </w:r>
-          </w:p>
-        </w:tc>
-        <w:tc>
-          <w:tcPr>
-            <w:tcW w:type="dxa" w:w="1987"/>
-          </w:tcPr>
-          <w:p>
-            <w:pPr>
-              <w:jc w:val="left"/>
-            </w:pPr>
-            <w:r>
-              <w:rPr>
-                <w:rFonts w:ascii="TimeNewRoman" w:hAnsi="TimeNewRoman"/>
-                <w:sz w:val="30"/>
-              </w:rPr>
-              <w:t>18+39=</w:t>
-            </w:r>
-          </w:p>
-        </w:tc>
-        <w:tc>
-          <w:tcPr>
-            <w:tcW w:type="dxa" w:w="1987"/>
-          </w:tcPr>
-          <w:p>
-            <w:pPr>
-              <w:jc w:val="left"/>
-            </w:pPr>
-            <w:r>
-              <w:rPr>
-                <w:rFonts w:ascii="TimeNewRoman" w:hAnsi="TimeNewRoman"/>
-                <w:sz w:val="30"/>
-              </w:rPr>
-              <w:t>6+25=</w:t>
-            </w:r>
-          </w:p>
-        </w:tc>
-      </w:tr>
-      <w:tr>
-        <w:tc>
-          <w:tcPr>
-            <w:tcW w:type="dxa" w:w="1987"/>
-          </w:tcPr>
-          <w:p>
-            <w:pPr>
-              <w:jc w:val="left"/>
-            </w:pPr>
-            <w:r>
-              <w:rPr>
-                <w:rFonts w:ascii="TimeNewRoman" w:hAnsi="TimeNewRoman"/>
-                <w:sz w:val="30"/>
-              </w:rPr>
-              <w:t>8+54=</w:t>
-            </w:r>
-          </w:p>
-        </w:tc>
-        <w:tc>
-          <w:tcPr>
-            <w:tcW w:type="dxa" w:w="1987"/>
-          </w:tcPr>
-          <w:p>
-            <w:pPr>
-              <w:jc w:val="left"/>
-            </w:pPr>
-            <w:r>
-              <w:rPr>
-                <w:rFonts w:ascii="TimeNewRoman" w:hAnsi="TimeNewRoman"/>
-                <w:sz w:val="30"/>
-              </w:rPr>
-              <w:t>51-22=</w:t>
-            </w:r>
-          </w:p>
-        </w:tc>
-        <w:tc>
-          <w:tcPr>
-            <w:tcW w:type="dxa" w:w="1987"/>
-          </w:tcPr>
-          <w:p>
-            <w:pPr>
-              <w:jc w:val="left"/>
-            </w:pPr>
-            <w:r>
-              <w:rPr>
-                <w:rFonts w:ascii="TimeNewRoman" w:hAnsi="TimeNewRoman"/>
-                <w:sz w:val="30"/>
-              </w:rPr>
-              <w:t>95-67=</w:t>
-            </w:r>
-          </w:p>
-        </w:tc>
-        <w:tc>
-          <w:tcPr>
-            <w:tcW w:type="dxa" w:w="1987"/>
-          </w:tcPr>
-          <w:p>
-            <w:pPr>
-              <w:jc w:val="left"/>
-            </w:pPr>
-            <w:r>
-              <w:rPr>
-                <w:rFonts w:ascii="TimeNewRoman" w:hAnsi="TimeNewRoman"/>
-                <w:sz w:val="30"/>
-              </w:rPr>
-              <w:t>34-18=</w:t>
-            </w:r>
-          </w:p>
-        </w:tc>
-        <w:tc>
-          <w:tcPr>
-            <w:tcW w:type="dxa" w:w="1987"/>
-          </w:tcPr>
-          <w:p>
-            <w:pPr>
-              <w:jc w:val="left"/>
-            </w:pPr>
-            <w:r>
-              <w:rPr>
-                <w:rFonts w:ascii="TimeNewRoman" w:hAnsi="TimeNewRoman"/>
-                <w:sz w:val="30"/>
-              </w:rPr>
-              <w:t>85-26=</w:t>
-            </w:r>
-          </w:p>
-        </w:tc>
-      </w:tr>
-      <w:tr>
-        <w:tc>
-          <w:tcPr>
-            <w:tcW w:type="dxa" w:w="1987"/>
-          </w:tcPr>
-          <w:p>
-            <w:pPr>
-              <w:jc w:val="left"/>
-            </w:pPr>
-            <w:r>
-              <w:rPr>
-                <w:rFonts w:ascii="TimeNewRoman" w:hAnsi="TimeNewRoman"/>
-                <w:sz w:val="30"/>
-              </w:rPr>
-              <w:t>90-72=</w:t>
-            </w:r>
-          </w:p>
-        </w:tc>
-        <w:tc>
-          <w:tcPr>
-            <w:tcW w:type="dxa" w:w="1987"/>
-          </w:tcPr>
-          <w:p>
-            <w:pPr>
-              <w:jc w:val="left"/>
-            </w:pPr>
-            <w:r>
-              <w:rPr>
-                <w:rFonts w:ascii="TimeNewRoman" w:hAnsi="TimeNewRoman"/>
-                <w:sz w:val="30"/>
-              </w:rPr>
-              <w:t>83-17=</w:t>
-            </w:r>
-          </w:p>
-        </w:tc>
-        <w:tc>
-          <w:tcPr>
-            <w:tcW w:type="dxa" w:w="1987"/>
-          </w:tcPr>
-          <w:p>
-            <w:pPr>
-              <w:jc w:val="left"/>
-            </w:pPr>
-            <w:r>
-              <w:rPr>
-                <w:rFonts w:ascii="TimeNewRoman" w:hAnsi="TimeNewRoman"/>
-                <w:sz w:val="30"/>
-              </w:rPr>
-              <w:t>19+6=</w:t>
-            </w:r>
-          </w:p>
-        </w:tc>
-        <w:tc>
-          <w:tcPr>
-            <w:tcW w:type="dxa" w:w="1987"/>
-          </w:tcPr>
-          <w:p>
-            <w:pPr>
-              <w:jc w:val="left"/>
-            </w:pPr>
-            <w:r>
-              <w:rPr>
-                <w:rFonts w:ascii="TimeNewRoman" w:hAnsi="TimeNewRoman"/>
-                <w:sz w:val="30"/>
-              </w:rPr>
-              <w:t>8+26=</w:t>
+              <w:t>36-7=</w:t>
             </w:r>
           </w:p>
         </w:tc>
@@ -1084,7 +1084,7 @@
                 <w:rFonts w:ascii="TimeNewRoman" w:hAnsi="TimeNewRoman"/>
                 <w:sz w:val="30"/>
               </w:rPr>
-              <w:t>81-72=</w:t>
+              <w:t>26+19=</w:t>
             </w:r>
           </w:p>
         </w:tc>
@@ -1101,7 +1101,7 @@
                 <w:rFonts w:ascii="TimeNewRoman" w:hAnsi="TimeNewRoman"/>
                 <w:sz w:val="30"/>
               </w:rPr>
-              <w:t>14+18=</w:t>
+              <w:t>2+59=</w:t>
             </w:r>
           </w:p>
         </w:tc>
@@ -1118,7 +1118,7 @@
                 <w:rFonts w:ascii="TimeNewRoman" w:hAnsi="TimeNewRoman"/>
                 <w:sz w:val="30"/>
               </w:rPr>
-              <w:t>27+25=</w:t>
+              <w:t>93-28=</w:t>
             </w:r>
           </w:p>
         </w:tc>
@@ -1135,7 +1135,7 @@
                 <w:rFonts w:ascii="TimeNewRoman" w:hAnsi="TimeNewRoman"/>
                 <w:sz w:val="30"/>
               </w:rPr>
-              <w:t>8+86=</w:t>
+              <w:t>46+18=</w:t>
             </w:r>
           </w:p>
         </w:tc>
@@ -1152,7 +1152,7 @@
                 <w:rFonts w:ascii="TimeNewRoman" w:hAnsi="TimeNewRoman"/>
                 <w:sz w:val="30"/>
               </w:rPr>
-              <w:t>44-28=</w:t>
+              <w:t>15+69=</w:t>
             </w:r>
           </w:p>
         </w:tc>
@@ -1171,7 +1171,7 @@
                 <w:rFonts w:ascii="TimeNewRoman" w:hAnsi="TimeNewRoman"/>
                 <w:sz w:val="30"/>
               </w:rPr>
-              <w:t>8+54=</w:t>
+              <w:t>56-9=</w:t>
             </w:r>
           </w:p>
         </w:tc>
@@ -1188,7 +1188,7 @@
                 <w:rFonts w:ascii="TimeNewRoman" w:hAnsi="TimeNewRoman"/>
                 <w:sz w:val="30"/>
               </w:rPr>
-              <w:t>15-8=</w:t>
+              <w:t>49+15=</w:t>
             </w:r>
           </w:p>
         </w:tc>
@@ -1205,7 +1205,7 @@
                 <w:rFonts w:ascii="TimeNewRoman" w:hAnsi="TimeNewRoman"/>
                 <w:sz w:val="30"/>
               </w:rPr>
-              <w:t>2+39=</w:t>
+              <w:t>40-25=</w:t>
             </w:r>
           </w:p>
         </w:tc>
@@ -1222,7 +1222,7 @@
                 <w:rFonts w:ascii="TimeNewRoman" w:hAnsi="TimeNewRoman"/>
                 <w:sz w:val="30"/>
               </w:rPr>
-              <w:t>6+76=</w:t>
+              <w:t>27+34=</w:t>
             </w:r>
           </w:p>
         </w:tc>
@@ -1239,7 +1239,7 @@
                 <w:rFonts w:ascii="TimeNewRoman" w:hAnsi="TimeNewRoman"/>
                 <w:sz w:val="30"/>
               </w:rPr>
-              <w:t>3+89=</w:t>
+              <w:t>25+68=</w:t>
             </w:r>
           </w:p>
         </w:tc>
@@ -1258,7 +1258,7 @@
                 <w:rFonts w:ascii="TimeNewRoman" w:hAnsi="TimeNewRoman"/>
                 <w:sz w:val="30"/>
               </w:rPr>
-              <w:t>93-74=</w:t>
+              <w:t>58+36=</w:t>
             </w:r>
           </w:p>
         </w:tc>
@@ -1275,7 +1275,7 @@
                 <w:rFonts w:ascii="TimeNewRoman" w:hAnsi="TimeNewRoman"/>
                 <w:sz w:val="30"/>
               </w:rPr>
-              <w:t>44-27=</w:t>
+              <w:t>9+65=</w:t>
             </w:r>
           </w:p>
         </w:tc>
@@ -1292,7 +1292,7 @@
                 <w:rFonts w:ascii="TimeNewRoman" w:hAnsi="TimeNewRoman"/>
                 <w:sz w:val="30"/>
               </w:rPr>
-              <w:t>90-64=</w:t>
+              <w:t>39+58=</w:t>
             </w:r>
           </w:p>
         </w:tc>
@@ -1309,7 +1309,7 @@
                 <w:rFonts w:ascii="TimeNewRoman" w:hAnsi="TimeNewRoman"/>
                 <w:sz w:val="30"/>
               </w:rPr>
-              <w:t>65-48=</w:t>
+              <w:t>43-9=</w:t>
             </w:r>
           </w:p>
         </w:tc>
@@ -1326,7 +1326,7 @@
                 <w:rFonts w:ascii="TimeNewRoman" w:hAnsi="TimeNewRoman"/>
                 <w:sz w:val="30"/>
               </w:rPr>
-              <w:t>80-33=</w:t>
+              <w:t>39+14=</w:t>
             </w:r>
           </w:p>
         </w:tc>
@@ -1345,7 +1345,7 @@
                 <w:rFonts w:ascii="TimeNewRoman" w:hAnsi="TimeNewRoman"/>
                 <w:sz w:val="30"/>
               </w:rPr>
-              <w:t>45-28=</w:t>
+              <w:t>24+7=</w:t>
             </w:r>
           </w:p>
         </w:tc>
@@ -1362,7 +1362,7 @@
                 <w:rFonts w:ascii="TimeNewRoman" w:hAnsi="TimeNewRoman"/>
                 <w:sz w:val="30"/>
               </w:rPr>
-              <w:t>47+17=</w:t>
+              <w:t>21-2=</w:t>
             </w:r>
           </w:p>
         </w:tc>
@@ -1379,7 +1379,7 @@
                 <w:rFonts w:ascii="TimeNewRoman" w:hAnsi="TimeNewRoman"/>
                 <w:sz w:val="30"/>
               </w:rPr>
-              <w:t>92-74=</w:t>
+              <w:t>57+28=</w:t>
             </w:r>
           </w:p>
         </w:tc>
@@ -1396,7 +1396,7 @@
                 <w:rFonts w:ascii="TimeNewRoman" w:hAnsi="TimeNewRoman"/>
                 <w:sz w:val="30"/>
               </w:rPr>
-              <w:t>56+8=</w:t>
+              <w:t>71-36=</w:t>
             </w:r>
           </w:p>
         </w:tc>
@@ -1413,7 +1413,7 @@
                 <w:rFonts w:ascii="TimeNewRoman" w:hAnsi="TimeNewRoman"/>
                 <w:sz w:val="30"/>
               </w:rPr>
-              <w:t>83-6=</w:t>
+              <w:t>17+37=</w:t>
             </w:r>
           </w:p>
         </w:tc>
@@ -1432,7 +1432,7 @@
                 <w:rFonts w:ascii="TimeNewRoman" w:hAnsi="TimeNewRoman"/>
                 <w:sz w:val="30"/>
               </w:rPr>
-              <w:t>47-39=</w:t>
+              <w:t>76+15=</w:t>
             </w:r>
           </w:p>
         </w:tc>
@@ -1449,7 +1449,7 @@
                 <w:rFonts w:ascii="TimeNewRoman" w:hAnsi="TimeNewRoman"/>
                 <w:sz w:val="30"/>
               </w:rPr>
-              <w:t>16+16=</w:t>
+              <w:t>12+29=</w:t>
             </w:r>
           </w:p>
         </w:tc>
@@ -1466,7 +1466,94 @@
                 <w:rFonts w:ascii="TimeNewRoman" w:hAnsi="TimeNewRoman"/>
                 <w:sz w:val="30"/>
               </w:rPr>
-              <w:t>23-4=</w:t>
+              <w:t>9+36=</w:t>
+            </w:r>
+          </w:p>
+        </w:tc>
+        <w:tc>
+          <w:tcPr>
+            <w:tcW w:type="dxa" w:w="1987"/>
+          </w:tcPr>
+          <w:p>
+            <w:pPr>
+              <w:jc w:val="left"/>
+            </w:pPr>
+            <w:r>
+              <w:rPr>
+                <w:rFonts w:ascii="TimeNewRoman" w:hAnsi="TimeNewRoman"/>
+                <w:sz w:val="30"/>
+              </w:rPr>
+              <w:t>17+34=</w:t>
+            </w:r>
+          </w:p>
+        </w:tc>
+        <w:tc>
+          <w:tcPr>
+            <w:tcW w:type="dxa" w:w="1987"/>
+          </w:tcPr>
+          <w:p>
+            <w:pPr>
+              <w:jc w:val="left"/>
+            </w:pPr>
+            <w:r>
+              <w:rPr>
+                <w:rFonts w:ascii="TimeNewRoman" w:hAnsi="TimeNewRoman"/>
+                <w:sz w:val="30"/>
+              </w:rPr>
+              <w:t>9+2=</w:t>
+            </w:r>
+          </w:p>
+        </w:tc>
+      </w:tr>
+      <w:tr>
+        <w:tc>
+          <w:tcPr>
+            <w:tcW w:type="dxa" w:w="1987"/>
+          </w:tcPr>
+          <w:p>
+            <w:pPr>
+              <w:jc w:val="left"/>
+            </w:pPr>
+            <w:r>
+              <w:rPr>
+                <w:rFonts w:ascii="TimeNewRoman" w:hAnsi="TimeNewRoman"/>
+                <w:sz w:val="30"/>
+              </w:rPr>
+              <w:t>18+15=</w:t>
+            </w:r>
+          </w:p>
+        </w:tc>
+        <w:tc>
+          <w:tcPr>
+            <w:tcW w:type="dxa" w:w="1987"/>
+          </w:tcPr>
+          <w:p>
+            <w:pPr>
+              <w:jc w:val="left"/>
+            </w:pPr>
+            <w:r>
+              <w:rPr>
+                <w:rFonts w:ascii="TimeNewRoman" w:hAnsi="TimeNewRoman"/>
+                <w:sz w:val="30"/>
+              </w:rPr>
+              <w:t>87-68=</w:t>
+            </w:r>
+          </w:p>
+        </w:tc>
+        <w:tc>
+          <w:tcPr>
+            <w:tcW w:type="dxa" w:w="1987"/>
+          </w:tcPr>
+          <w:p>
+            <w:pPr>
+              <w:jc w:val="left"/>
+            </w:pPr>
+            <w:r>
+              <w:rPr>
+                <w:rFonts w:ascii="TimeNewRoman" w:hAnsi="TimeNewRoman"/>
+                <w:sz w:val="30"/>
+              </w:rPr>
+              <w:t>90-45=</w:t>
             </w:r>
           </w:p>
         </w:tc>
@@ -1500,7 +1587,7 @@
                 <w:rFonts w:ascii="TimeNewRoman" w:hAnsi="TimeNewRoman"/>
                 <w:sz w:val="30"/>
               </w:rPr>
-              <w:t>40-3=</w:t>
+              <w:t>19+55=</w:t>
             </w:r>
           </w:p>
         </w:tc>
@@ -1519,7 +1606,7 @@
                 <w:rFonts w:ascii="TimeNewRoman" w:hAnsi="TimeNewRoman"/>
                 <w:sz w:val="30"/>
               </w:rPr>
-              <w:t>16+69=</w:t>
+              <w:t>95-59=</w:t>
             </w:r>
           </w:p>
         </w:tc>
@@ -1536,7 +1623,7 @@
                 <w:rFonts w:ascii="TimeNewRoman" w:hAnsi="TimeNewRoman"/>
                 <w:sz w:val="30"/>
               </w:rPr>
-              <w:t>53+39=</w:t>
+              <w:t>64-27=</w:t>
             </w:r>
           </w:p>
         </w:tc>
@@ -1553,7 +1640,7 @@
                 <w:rFonts w:ascii="TimeNewRoman" w:hAnsi="TimeNewRoman"/>
                 <w:sz w:val="30"/>
               </w:rPr>
-              <w:t>87+7=</w:t>
+              <w:t>63-5=</w:t>
             </w:r>
           </w:p>
         </w:tc>
@@ -1570,7 +1657,7 @@
                 <w:rFonts w:ascii="TimeNewRoman" w:hAnsi="TimeNewRoman"/>
                 <w:sz w:val="30"/>
               </w:rPr>
-              <w:t>64-48=</w:t>
+              <w:t>93-7=</w:t>
             </w:r>
           </w:p>
         </w:tc>
@@ -1587,7 +1674,7 @@
                 <w:rFonts w:ascii="TimeNewRoman" w:hAnsi="TimeNewRoman"/>
                 <w:sz w:val="30"/>
               </w:rPr>
-              <w:t>63+8=</w:t>
+              <w:t>18+9=</w:t>
             </w:r>
           </w:p>
         </w:tc>
@@ -1606,7 +1693,7 @@
                 <w:rFonts w:ascii="TimeNewRoman" w:hAnsi="TimeNewRoman"/>
                 <w:sz w:val="30"/>
               </w:rPr>
-              <w:t>15-6=</w:t>
+              <w:t>60-14=</w:t>
             </w:r>
           </w:p>
         </w:tc>
@@ -1623,7 +1710,7 @@
                 <w:rFonts w:ascii="TimeNewRoman" w:hAnsi="TimeNewRoman"/>
                 <w:sz w:val="30"/>
               </w:rPr>
-              <w:t>86+9=</w:t>
+              <w:t>4+57=</w:t>
             </w:r>
           </w:p>
         </w:tc>
@@ -1640,7 +1727,7 @@
                 <w:rFonts w:ascii="TimeNewRoman" w:hAnsi="TimeNewRoman"/>
                 <w:sz w:val="30"/>
               </w:rPr>
-              <w:t>29+45=</w:t>
+              <w:t>95-77=</w:t>
             </w:r>
           </w:p>
         </w:tc>
@@ -1657,7 +1744,7 @@
                 <w:rFonts w:ascii="TimeNewRoman" w:hAnsi="TimeNewRoman"/>
                 <w:sz w:val="30"/>
               </w:rPr>
-              <w:t>91-86=</w:t>
+              <w:t>72-17=</w:t>
             </w:r>
           </w:p>
         </w:tc>
@@ -1674,94 +1761,7 @@
                 <w:rFonts w:ascii="TimeNewRoman" w:hAnsi="TimeNewRoman"/>
                 <w:sz w:val="30"/>
               </w:rPr>
-              <w:t>16-9=</w:t>
-            </w:r>
-          </w:p>
-        </w:tc>
-      </w:tr>
-      <w:tr>
-        <w:tc>
-          <w:tcPr>
-            <w:tcW w:type="dxa" w:w="1987"/>
-          </w:tcPr>
-          <w:p>
-            <w:pPr>
-              <w:jc w:val="left"/>
-            </w:pPr>
-            <w:r>
-              <w:rPr>
-                <w:rFonts w:ascii="TimeNewRoman" w:hAnsi="TimeNewRoman"/>
-                <w:sz w:val="30"/>
-              </w:rPr>
-              <w:t>33+59=</w:t>
-            </w:r>
-          </w:p>
-        </w:tc>
-        <w:tc>
-          <w:tcPr>
-            <w:tcW w:type="dxa" w:w="1987"/>
-          </w:tcPr>
-          <w:p>
-            <w:pPr>
-              <w:jc w:val="left"/>
-            </w:pPr>
-            <w:r>
-              <w:rPr>
-                <w:rFonts w:ascii="TimeNewRoman" w:hAnsi="TimeNewRoman"/>
-                <w:sz w:val="30"/>
-              </w:rPr>
-              <w:t>57+36=</w:t>
-            </w:r>
-          </w:p>
-        </w:tc>
-        <w:tc>
-          <w:tcPr>
-            <w:tcW w:type="dxa" w:w="1987"/>
-          </w:tcPr>
-          <w:p>
-            <w:pPr>
-              <w:jc w:val="left"/>
-            </w:pPr>
-            <w:r>
-              <w:rPr>
-                <w:rFonts w:ascii="TimeNewRoman" w:hAnsi="TimeNewRoman"/>
-                <w:sz w:val="30"/>
-              </w:rPr>
-              <w:t>40-16=</w:t>
-            </w:r>
-          </w:p>
-        </w:tc>
-        <w:tc>
-          <w:tcPr>
-            <w:tcW w:type="dxa" w:w="1987"/>
-          </w:tcPr>
-          <w:p>
-            <w:pPr>
-              <w:jc w:val="left"/>
-            </w:pPr>
-            <w:r>
-              <w:rPr>
-                <w:rFonts w:ascii="TimeNewRoman" w:hAnsi="TimeNewRoman"/>
-                <w:sz w:val="30"/>
-              </w:rPr>
-              <w:t>29+52=</w:t>
-            </w:r>
-          </w:p>
-        </w:tc>
-        <w:tc>
-          <w:tcPr>
-            <w:tcW w:type="dxa" w:w="1987"/>
-          </w:tcPr>
-          <w:p>
-            <w:pPr>
-              <w:jc w:val="left"/>
-            </w:pPr>
-            <w:r>
-              <w:rPr>
-                <w:rFonts w:ascii="TimeNewRoman" w:hAnsi="TimeNewRoman"/>
-                <w:sz w:val="30"/>
-              </w:rPr>
-              <w:t>53-49=</w:t>
+              <w:t>83-66=</w:t>
             </w:r>
           </w:p>
         </w:tc>

</xml_diff>